<commit_message>
Restructure resume with client/training/spec/content sections
Splits experience into Client Experience, Training Project (Copy
Millions Blueprint case study), Additional Spec Work, and Content
Creation (YouTube). Updates dates and adds ranked skills list.
</commit_message>
<xml_diff>
--- a/resume/Dylan_Escobar_Resume.docx
+++ b/resume/Dylan_Escobar_Resume.docx
@@ -108,7 +108,7 @@
           <w:color w:val="0E0E10"/>
           <w:sz w:val="21"/>
         </w:rPr>
-        <w:t>Freelance creative strategist specializing in Meta ad hook/script writing, static and AI-video ad production, and ad research for DTC brands. Built and grew a YouTube channel (@BillionaireHustler) to 700K+ lifetime views and 800+ subscribers with zero ad spend (91%+ like ratio, 42K-view top clip) — applying direct-response and audience-retention principles to client ad work.</w:t>
+        <w:t>Direct-response creative strategist specializing in Meta ad hook/script writing, static and AI-video ad production, and ad research for DTC brands. Grew a YouTube channel to 700K+ lifetime views and 800+ subscribers with zero ad spend (91%+ like ratio, 42K-view top clip), applying audience-retention and hook-writing principles directly to client ad work.</w:t>
       </w:r>
     </w:p>
     <w:p>
@@ -128,7 +128,7 @@
           <w:color w:val="E8402C"/>
           <w:sz w:val="23"/>
         </w:rPr>
-        <w:t>Experience</w:t>
+        <w:t>Client Experience</w:t>
       </w:r>
     </w:p>
     <w:p>
@@ -169,7 +169,7 @@
           <w:color w:val="0E0E10"/>
           <w:sz w:val="20"/>
         </w:rPr>
-        <w:t>May 2026 – June 2026</w:t>
+        <w:t>May 2025 – Present</w:t>
       </w:r>
     </w:p>
     <w:p>
@@ -187,7 +187,7 @@
           <w:color w:val="0E0E10"/>
           <w:sz w:val="21"/>
         </w:rPr>
-        <w:t>Engaged by a multi-brand DTC portfolio (Tailored Canvases, WonderMe, TellMyTale) to build full ad script systems across three brands in parallel.</w:t>
+        <w:t>Engaged by a multi-brand DTC portfolio (Tailored Canvases, WonderMe, TellMyTale) to build full ad script systems across three brands in parallel (May–June 2026).</w:t>
       </w:r>
     </w:p>
     <w:p>
@@ -279,7 +279,7 @@
           <w:color w:val="E8402C"/>
           <w:sz w:val="23"/>
         </w:rPr>
-        <w:t>Additional Projects</w:t>
+        <w:t>Training Project — Copy Millions Blueprint</w:t>
       </w:r>
     </w:p>
     <w:p>
@@ -297,7 +297,27 @@
           <w:color w:val="0E0E10"/>
           <w:sz w:val="21"/>
         </w:rPr>
-        <w:t>Brand/VOC research for Enhanced Human, Outdoor Vitals, Beam, ManTalks, and Hatch.</w:t>
+        <w:t>Outdoor Vitals (ultralight backpacking gear) case study: Built a full brand research document and produced 5 ad scripts and static ad concepts as an applied training project within the Copy Millions Blueprint coaching program.</w:t>
+      </w:r>
+    </w:p>
+    <w:p>
+      <w:pPr>
+        <w:keepNext/>
+        <w:spacing w:before="240" w:after="60"/>
+        <w:pBdr>
+          <w:bottom w:val="single" w:sz="6" w:space="2" w:color="E8402C"/>
+        </w:pBdr>
+      </w:pPr>
+      <w:r>
+        <w:rPr>
+          <w:rFonts w:ascii="Calibri" w:hAnsi="Calibri"/>
+          <w:b/>
+          <w:i w:val="0"/>
+          <w:caps/>
+          <w:color w:val="E8402C"/>
+          <w:sz w:val="23"/>
+        </w:rPr>
+        <w:t>Additional Spec Work (Self-Directed)</w:t>
       </w:r>
     </w:p>
     <w:p>
@@ -315,7 +335,122 @@
           <w:color w:val="0E0E10"/>
           <w:sz w:val="21"/>
         </w:rPr>
-        <w:t>Ad creative and copy across DTC verticals: electrolyte drinks, travel gear, cosmetics, wellness, and consumer products (spec + client work).</w:t>
+        <w:t>Spec ad development across DTC verticals: electrolyte drinks, travel gear, cosmetics, wellness, and other consumer products — building buyer personas, hook libraries, and full video scripts.</w:t>
+      </w:r>
+    </w:p>
+    <w:p>
+      <w:pPr>
+        <w:keepNext/>
+        <w:spacing w:before="240" w:after="60"/>
+        <w:pBdr>
+          <w:bottom w:val="single" w:sz="6" w:space="2" w:color="E8402C"/>
+        </w:pBdr>
+      </w:pPr>
+      <w:r>
+        <w:rPr>
+          <w:rFonts w:ascii="Calibri" w:hAnsi="Calibri"/>
+          <w:b/>
+          <w:i w:val="0"/>
+          <w:caps/>
+          <w:color w:val="E8402C"/>
+          <w:sz w:val="23"/>
+        </w:rPr>
+        <w:t>Content Creation</w:t>
+      </w:r>
+    </w:p>
+    <w:p>
+      <w:pPr>
+        <w:tabs>
+          <w:tab w:pos="10368" w:val="right"/>
+        </w:tabs>
+        <w:spacing w:before="80" w:after="40"/>
+      </w:pPr>
+      <w:r>
+        <w:rPr>
+          <w:rFonts w:ascii="Calibri" w:hAnsi="Calibri"/>
+          <w:b/>
+          <w:i w:val="0"/>
+          <w:caps w:val="0"/>
+          <w:color w:val="0E0E10"/>
+          <w:sz w:val="21"/>
+        </w:rPr>
+        <w:t>YouTube Channel — @BillionaireHustler</w:t>
+      </w:r>
+      <w:r>
+        <w:rPr>
+          <w:rFonts w:ascii="Calibri" w:hAnsi="Calibri"/>
+          <w:b w:val="0"/>
+          <w:i w:val="0"/>
+          <w:caps w:val="0"/>
+          <w:color w:val="0E0E10"/>
+          <w:sz w:val="21"/>
+        </w:rPr>
+        <w:tab/>
+      </w:r>
+      <w:r>
+        <w:rPr>
+          <w:rFonts w:ascii="Calibri" w:hAnsi="Calibri"/>
+          <w:b w:val="0"/>
+          <w:i/>
+          <w:caps w:val="0"/>
+          <w:color w:val="0E0E10"/>
+          <w:sz w:val="20"/>
+        </w:rPr>
+        <w:t>October 2023 – Present</w:t>
+      </w:r>
+    </w:p>
+    <w:p>
+      <w:pPr>
+        <w:pStyle w:val="ListBullet"/>
+        <w:spacing w:after="40" w:line="252" w:lineRule="auto"/>
+        <w:ind w:left="288"/>
+      </w:pPr>
+      <w:r>
+        <w:rPr>
+          <w:rFonts w:ascii="Calibri" w:hAnsi="Calibri"/>
+          <w:b w:val="0"/>
+          <w:i w:val="0"/>
+          <w:caps w:val="0"/>
+          <w:color w:val="0E0E10"/>
+          <w:sz w:val="21"/>
+        </w:rPr>
+        <w:t>Grew channel to 700K+ lifetime views and 800+ subscribers with zero ad spend.</w:t>
+      </w:r>
+    </w:p>
+    <w:p>
+      <w:pPr>
+        <w:pStyle w:val="ListBullet"/>
+        <w:spacing w:after="40" w:line="252" w:lineRule="auto"/>
+        <w:ind w:left="288"/>
+      </w:pPr>
+      <w:r>
+        <w:rPr>
+          <w:rFonts w:ascii="Calibri" w:hAnsi="Calibri"/>
+          <w:b w:val="0"/>
+          <w:i w:val="0"/>
+          <w:caps w:val="0"/>
+          <w:color w:val="0E0E10"/>
+          <w:sz w:val="21"/>
+        </w:rPr>
+        <w:t>Achieved a 91%+ like ratio and a top-performing clip at 42K views.</w:t>
+      </w:r>
+    </w:p>
+    <w:p>
+      <w:pPr>
+        <w:pStyle w:val="ListBullet"/>
+        <w:spacing w:after="40" w:line="252" w:lineRule="auto"/>
+        <w:ind w:left="288"/>
+      </w:pPr>
+      <w:r>
+        <w:rPr>
+          <w:rFonts w:ascii="Calibri" w:hAnsi="Calibri"/>
+          <w:b w:val="0"/>
+          <w:i w:val="0"/>
+          <w:caps w:val="0"/>
+          <w:color w:val="0E0E10"/>
+          <w:sz w:val="21"/>
+        </w:rPr>
+        <w:t>Applied direct-response and retention principles learned from running the channel to client ad strategy work.</w:t>
       </w:r>
     </w:p>
     <w:p>
@@ -396,8 +531,20 @@
     </w:p>
     <w:p>
       <w:pPr>
-        <w:spacing w:after="0"/>
+        <w:spacing w:after="40"/>
+        <w:ind w:left="288"/>
       </w:pPr>
+      <w:r>
+        <w:rPr>
+          <w:rFonts w:ascii="Calibri" w:hAnsi="Calibri"/>
+          <w:b/>
+          <w:i w:val="0"/>
+          <w:caps w:val="0"/>
+          <w:color w:val="0E0E10"/>
+          <w:sz w:val="21"/>
+        </w:rPr>
+        <w:t xml:space="preserve">1.  </w:t>
+      </w:r>
       <w:r>
         <w:rPr>
           <w:rFonts w:ascii="Calibri" w:hAnsi="Calibri"/>
@@ -407,7 +554,119 @@
           <w:color w:val="0E0E10"/>
           <w:sz w:val="21"/>
         </w:rPr>
-        <w:t>Meta ad strategy, direct-response copywriting, hook writing, script writing, AI video ad production, static ad design, VOC/audience research, YouTube content strategy, DTC brand research</w:t>
+        <w:t>Meta ad hook &amp; script writing</w:t>
+      </w:r>
+    </w:p>
+    <w:p>
+      <w:pPr>
+        <w:spacing w:after="40"/>
+        <w:ind w:left="288"/>
+      </w:pPr>
+      <w:r>
+        <w:rPr>
+          <w:rFonts w:ascii="Calibri" w:hAnsi="Calibri"/>
+          <w:b/>
+          <w:i w:val="0"/>
+          <w:caps w:val="0"/>
+          <w:color w:val="0E0E10"/>
+          <w:sz w:val="21"/>
+        </w:rPr>
+        <w:t xml:space="preserve">2.  </w:t>
+      </w:r>
+      <w:r>
+        <w:rPr>
+          <w:rFonts w:ascii="Calibri" w:hAnsi="Calibri"/>
+          <w:b w:val="0"/>
+          <w:i w:val="0"/>
+          <w:caps w:val="0"/>
+          <w:color w:val="0E0E10"/>
+          <w:sz w:val="21"/>
+        </w:rPr>
+        <w:t>Direct-response copywriting</w:t>
+      </w:r>
+    </w:p>
+    <w:p>
+      <w:pPr>
+        <w:spacing w:after="40"/>
+        <w:ind w:left="288"/>
+      </w:pPr>
+      <w:r>
+        <w:rPr>
+          <w:rFonts w:ascii="Calibri" w:hAnsi="Calibri"/>
+          <w:b/>
+          <w:i w:val="0"/>
+          <w:caps w:val="0"/>
+          <w:color w:val="0E0E10"/>
+          <w:sz w:val="21"/>
+        </w:rPr>
+        <w:t xml:space="preserve">3.  </w:t>
+      </w:r>
+      <w:r>
+        <w:rPr>
+          <w:rFonts w:ascii="Calibri" w:hAnsi="Calibri"/>
+          <w:b w:val="0"/>
+          <w:i w:val="0"/>
+          <w:caps w:val="0"/>
+          <w:color w:val="0E0E10"/>
+          <w:sz w:val="21"/>
+        </w:rPr>
+        <w:t>AI-video and static ad production</w:t>
+      </w:r>
+    </w:p>
+    <w:p>
+      <w:pPr>
+        <w:spacing w:after="40"/>
+        <w:ind w:left="288"/>
+      </w:pPr>
+      <w:r>
+        <w:rPr>
+          <w:rFonts w:ascii="Calibri" w:hAnsi="Calibri"/>
+          <w:b/>
+          <w:i w:val="0"/>
+          <w:caps w:val="0"/>
+          <w:color w:val="0E0E10"/>
+          <w:sz w:val="21"/>
+        </w:rPr>
+        <w:t xml:space="preserve">4.  </w:t>
+      </w:r>
+      <w:r>
+        <w:rPr>
+          <w:rFonts w:ascii="Calibri" w:hAnsi="Calibri"/>
+          <w:b w:val="0"/>
+          <w:i w:val="0"/>
+          <w:caps w:val="0"/>
+          <w:color w:val="0E0E10"/>
+          <w:sz w:val="21"/>
+        </w:rPr>
+        <w:t>Audience/VOC research</w:t>
+      </w:r>
+    </w:p>
+    <w:p>
+      <w:pPr>
+        <w:spacing w:after="40"/>
+        <w:ind w:left="288"/>
+      </w:pPr>
+      <w:r>
+        <w:rPr>
+          <w:rFonts w:ascii="Calibri" w:hAnsi="Calibri"/>
+          <w:b/>
+          <w:i w:val="0"/>
+          <w:caps w:val="0"/>
+          <w:color w:val="0E0E10"/>
+          <w:sz w:val="21"/>
+        </w:rPr>
+        <w:t xml:space="preserve">5.  </w:t>
+      </w:r>
+      <w:r>
+        <w:rPr>
+          <w:rFonts w:ascii="Calibri" w:hAnsi="Calibri"/>
+          <w:b w:val="0"/>
+          <w:i w:val="0"/>
+          <w:caps w:val="0"/>
+          <w:color w:val="0E0E10"/>
+          <w:sz w:val="21"/>
+        </w:rPr>
+        <w:t>YouTube content strategy &amp; audience retention</w:t>
       </w:r>
     </w:p>
     <w:sectPr>

</xml_diff>